<commit_message>
feat(validation): confirm forcing factor x1 against the meltmodel paper
scripts/validate_constant_forcing.py holds each region's source
anomaly from the paper's four scenarios constant for 500 yr and runs
it through the pipeline's convolution with the real kernels. Against
the paper's site anomalies (proxymag.pkl), factor 1 gives a median
ratio of 0.98 (18.2 ka cold 0.96-1.02 at all nine sites) and factor
10 gives 9.8. The remaining scatter comes from using 17.8 ka kernels
for the 19.4 and 20.7 ka slices. Laura chose factor 1.

The explorer drops the x10 switch (the code stays; it hides itself
with one factor), the footer and schematic state the validation, the
report reports it with inline numbers, and the open question in
CLAUDE.md becomes a resolved one, with the docs updated to match.

Prompts:
- 2026-10-01-006-validate-constant-forcing-against-paper
- 2026-10-01-007-factor-x1

Assisted-by: Claude claude-opus-5-5
</commit_message>
<xml_diff>
--- a/site_anomalies_v2.docx
+++ b/site_anomalies_v2.docx
@@ -618,13 +618,73 @@
         <w:t xml:space="preserve"> </w:t>
       </w:r>
       <w:r>
-        <w:t xml:space="preserve">reaches the paper’s equilibrium anomaly. What the forward model changes is</w:t>
-      </w:r>
-      <w:r>
-        <w:t xml:space="preserve"> </w:t>
-      </w:r>
-      <w:r>
-        <w:t xml:space="preserve">the timing: short pulses arrive later and more spread out.</w:t>
+        <w:t xml:space="preserve">reaches the paper’s equilibrium anomaly. As a direct test, each region’s</w:t>
+      </w:r>
+      <w:r>
+        <w:t xml:space="preserve"> </w:t>
+      </w:r>
+      <w:r>
+        <w:t xml:space="preserve">source anomaly of the paper’s four scenarios was held constant for 500 years</w:t>
+      </w:r>
+      <w:r>
+        <w:t xml:space="preserve"> </w:t>
+      </w:r>
+      <w:r>
+        <w:t xml:space="preserve">and run through the convolution. The resulting site anomalies agree with the</w:t>
+      </w:r>
+      <w:r>
+        <w:t xml:space="preserve"> </w:t>
+      </w:r>
+      <w:r>
+        <w:t xml:space="preserve">paper’s (median ratio 0.98, 5–95 % range</w:t>
+      </w:r>
+      <w:r>
+        <w:t xml:space="preserve"> </w:t>
+      </w:r>
+      <w:r>
+        <w:t xml:space="preserve">0.70–1.16). Most of the</w:t>
+      </w:r>
+      <w:r>
+        <w:t xml:space="preserve"> </w:t>
+      </w:r>
+      <w:r>
+        <w:t xml:space="preserve">scatter is expected: the pulse responses come from the 17.8 ka simulations,</w:t>
+      </w:r>
+      <w:r>
+        <w:t xml:space="preserve"> </w:t>
+      </w:r>
+      <w:r>
+        <w:t xml:space="preserve">while the paper’s 19.4 and 20.7 ka site values use those time slices’ own</w:t>
+      </w:r>
+      <w:r>
+        <w:t xml:space="preserve"> </w:t>
+      </w:r>
+      <w:r>
+        <w:t xml:space="preserve">ocean states.</w:t>
+      </w:r>
+      <w:r>
+        <w:t xml:space="preserve"> </w:t>
+      </w:r>
+      <w:r>
+        <w:t xml:space="preserve">This is why the forcing gets no extra factor; the 2025.05 convolution</w:t>
+      </w:r>
+      <w:r>
+        <w:t xml:space="preserve"> </w:t>
+      </w:r>
+      <w:r>
+        <w:t xml:space="preserve">notebook multiplied it by 10, which gives 9.8</w:t>
+      </w:r>
+      <w:r>
+        <w:t xml:space="preserve"> </w:t>
+      </w:r>
+      <w:r>
+        <w:t xml:space="preserve">times the paper’s values. What the forward model changes is the timing:</w:t>
+      </w:r>
+      <w:r>
+        <w:t xml:space="preserve"> </w:t>
+      </w:r>
+      <w:r>
+        <w:t xml:space="preserve">short pulses arrive later and more spread out.</w:t>
       </w:r>
     </w:p>
     <w:p>
@@ -4003,46 +4063,6 @@
           <w:b/>
           <w:bCs/>
         </w:rPr>
-        <w:t xml:space="preserve">Forcing factor.</w:t>
-      </w:r>
-      <w:r>
-        <w:t xml:space="preserve"> </w:t>
-      </w:r>
-      <w:r>
-        <w:t xml:space="preserve">This report uses the forcing as it is (factor 1). The</w:t>
-      </w:r>
-      <w:r>
-        <w:t xml:space="preserve"> </w:t>
-      </w:r>
-      <w:r>
-        <w:t xml:space="preserve">2025.05 convolution notebook multiplied it by 10, and which factor is right</w:t>
-      </w:r>
-      <w:r>
-        <w:t xml:space="preserve"> </w:t>
-      </w:r>
-      <w:r>
-        <w:t xml:space="preserve">is under review. Shares, dominance, variance shares and the spider shapes</w:t>
-      </w:r>
-      <w:r>
-        <w:t xml:space="preserve"> </w:t>
-      </w:r>
-      <w:r>
-        <w:t xml:space="preserve">are the same under both; anomaly values and SDs would be ten times larger.</w:t>
-      </w:r>
-    </w:p>
-    <w:p>
-      <w:pPr>
-        <w:pStyle w:val="Compact"/>
-        <w:numPr>
-          <w:ilvl w:val="0"/>
-          <w:numId w:val="1002"/>
-        </w:numPr>
-      </w:pPr>
-      <w:r>
-        <w:rPr>
-          <w:b/>
-          <w:bCs/>
-        </w:rPr>
         <w:t xml:space="preserve">Metrics.</w:t>
       </w:r>
       <w:r>

</xml_diff>